<commit_message>
Temporarily disable Basic SSH host key checks
</commit_message>
<xml_diff>
--- a/docs/04_Cyber_Department_Testing_Guide.docx
+++ b/docs/04_Cyber_Department_Testing_Guide.docx
@@ -70,7 +70,7 @@
     </w:p>
     <w:p>
       <w:r>
-        <w:t>Have the network owner confirm switch management addresses, IOS or IOS XE platform, supported software releases, SSH credentials and any enable secret, authorized assessment scope, and the matching checklist benchmark release. Live collection uses selected read-only show commands over SSH port 22. Before connecting, independently verify each device's SSH server fingerprint and enroll its key in the current Windows account's known_hosts file. Unknown or changed keys stop collection.</w:t>
+        <w:t>Have the network owner confirm switch management addresses, IOS or IOS XE platform, supported software releases, SSH credentials and any enable secret, authorized assessment scope, and the matching checklist benchmark release. Live collection uses selected read-only show commands over SSH port 22. Before connecting, confirm each device address, port, account, and approved assessment scope. Basic host-key verification is temporarily disabled for compatibility; restore it before production deployment.</w:t>
       </w:r>
     </w:p>
     <w:p>
@@ -193,7 +193,7 @@
     </w:p>
     <w:p>
       <w:r>
-        <w:t>Use authorized lab switches. Independently verify and enroll their SSH server fingerprints before Live SSH. Confirm an unknown or changed key is rejected without running audit commands; do not disable host-key verification. Select the correct platform and site profile, run IOS and IOS XE separately, and use a fresh output folder for every run. Compare per-device results with independently reviewed device configuration.</w:t>
+        <w:t>Use authorized lab switches. Confirm the device address, port, account, and approved assessment scope before Live SSH. Basic host-key verification is temporarily disabled for compatibility; record this as a release limitation and restore it before production deployment. Select the correct platform and site profile, run IOS and IOS XE separately, and use a fresh output folder for every run. Compare per-device results with independently reviewed device configuration.</w:t>
       </w:r>
     </w:p>
     <w:p>
@@ -271,7 +271,7 @@
         <w:pStyle w:val="ListBullet"/>
       </w:pPr>
       <w:r>
-        <w:t>Basic's strict SSH host-key behavior is covered by simulated tests. A live authorized-device handshake still requires a separately recorded pilot using an independently verified fingerprint.</w:t>
+        <w:t>Basic's temporary host-key-disabled behavior is covered by simulated tests. A live authorized-device handshake still requires a separately recorded pilot on an approved device, and host-key verification must be restored before production deployment.</w:t>
       </w:r>
     </w:p>
     <w:p>

</xml_diff>